<commit_message>
docs: finalize multilingual evaluation package
</commit_message>
<xml_diff>
--- a/docs/2care-submission-writeup.docx
+++ b/docs/2care-submission-writeup.docx
@@ -82,7 +82,7 @@
               <w:rPr>
                 <w:color w:val="0B2545"/>
               </w:rPr>
-              <w:t>The implementation is live and independently callable. This document reports the completed engineering work and the observed pilot evidence honestly. The complete 17-scenario live bake-off required by the assignment has not yet been run; the limitations section identifies this explicitly.</w:t>
+              <w:t>The implementation is live and independently callable. This document reports the completed engineering work and the observed pilot evidence honestly. The complete 51-call multilingual bake-off required by the assignment has not yet been run; the limitations section identifies this explicitly.</w:t>
             </w:r>
           </w:p>
         </w:tc>
@@ -663,7 +663,7 @@
                 <w:b w:val="0"/>
                 <w:sz w:val="18"/>
               </w:rPr>
-              <w:t>GitHub Actions deploy-staging run #32, successful</w:t>
+              <w:t>Latest successful GitHub Actions deploy-staging run is linked from the README</w:t>
             </w:r>
           </w:p>
         </w:tc>
@@ -2290,7 +2290,7 @@
           <w:i w:val="0"/>
           <w:sz w:val="22"/>
         </w:rPr>
-        <w:t>The repository contains 17 versioned multi-turn scenarios across English, Hindi, and Hinglish, a redaction validator, a renderer, and per-language reporting. The strict validator is designed to prevent a partial or blended result from being presented as complete coverage.</w:t>
+        <w:t>The repository contains 17 versioned multi-turn scenarios and requires each scenario in English, Hindi, and Hinglish: 51 live calls in total. It includes a redaction validator, a renderer, and per-language reporting. The strict validator rejects partial or blended coverage.</w:t>
       </w:r>
     </w:p>
     <w:p>
@@ -3137,7 +3137,7 @@
         <w:spacing w:after="60" w:line="259" w:lineRule="auto"/>
       </w:pPr>
       <w:r>
-        <w:t>Run every versioned scenario in the required language mode and record redacted scenario-level measurements.</w:t>
+        <w:t>Run all 17 scenarios in English, Hindi, and Hinglish, for 51 total calls, and record redacted scenario-level measurements.</w:t>
       </w:r>
     </w:p>
     <w:p>
@@ -3276,7 +3276,7 @@
           <w:i w:val="0"/>
           <w:sz w:val="22"/>
         </w:rPr>
-        <w:t>The repository also includes an observed pilot report from eight completed calls. It is clearly labeled as exploratory evidence; the complete 17-scenario live evaluation remains identified as pending rather than overstated.</w:t>
+        <w:t>The repository also includes an observed pilot report from eight completed calls. It is clearly labeled as exploratory evidence; the complete 51-call multilingual evaluation remains identified as pending rather than overstated.</w:t>
       </w:r>
     </w:p>
     <w:p>
@@ -3877,7 +3877,7 @@
           <w:color w:val="555555"/>
           <w:sz w:val="18"/>
         </w:rPr>
-        <w:t>Prepared from repository state at commit 3a03338 on 2026-07-20.</w:t>
+        <w:t>Prepared from the repository state on 2026-07-20; see the GitHub commit history for the exact revision.</w:t>
       </w:r>
     </w:p>
     <w:sectPr>

</xml_diff>